<commit_message>
Edits to SDD and TSD
</commit_message>
<xml_diff>
--- a/Insomniac_System_Description_Document.docx
+++ b/Insomniac_System_Description_Document.docx
@@ -70,13 +70,53 @@
         <w:rPr>
           <w:rFonts w:ascii="Times New Roman" w:hAnsi="Times New Roman" w:cs="Times New Roman"/>
         </w:rPr>
-        <w:t>Insomniac</w:t>
+        <w:t>Insomnia</w:t>
       </w:r>
     </w:p>
     <w:p/>
     <w:p/>
-    <w:p/>
-    <w:p/>
+    <w:p>
+      <w:pPr>
+        <w:pStyle w:val="IntenseQuote"/>
+        <w:rPr>
+          <w:i w:val="0"/>
+          <w:iCs w:val="0"/>
+          <w:color w:val="000000" w:themeColor="text1"/>
+          <w:sz w:val="28"/>
+          <w:szCs w:val="28"/>
+        </w:rPr>
+      </w:pPr>
+      <w:r>
+        <w:rPr>
+          <w:i w:val="0"/>
+          <w:iCs w:val="0"/>
+          <w:color w:val="000000" w:themeColor="text1"/>
+          <w:sz w:val="28"/>
+          <w:szCs w:val="28"/>
+        </w:rPr>
+        <w:t>Prepared by:</w:t>
+      </w:r>
+      <w:r>
+        <w:rPr>
+          <w:i w:val="0"/>
+          <w:iCs w:val="0"/>
+          <w:color w:val="000000" w:themeColor="text1"/>
+          <w:sz w:val="28"/>
+          <w:szCs w:val="28"/>
+        </w:rPr>
+        <w:br/>
+      </w:r>
+      <w:r>
+        <w:rPr>
+          <w:i w:val="0"/>
+          <w:iCs w:val="0"/>
+          <w:color w:val="000000" w:themeColor="text1"/>
+          <w:sz w:val="28"/>
+          <w:szCs w:val="28"/>
+        </w:rPr>
+        <w:t>Jessica Coffel, Thomas DiGuido, and Nick Pokusa</w:t>
+      </w:r>
+    </w:p>
     <w:p/>
     <w:p/>
     <w:p/>
@@ -2232,54 +2272,22 @@
           <w:i/>
           <w:iCs/>
         </w:rPr>
-        <w:t xml:space="preserve">7) Applications Management will provide final sign-off and from that point will take responsibility for keeping the document </w:t>
-      </w:r>
-      <w:proofErr w:type="gramStart"/>
-      <w:r>
+        <w:t>7) Applications Management will provide final sign-off and from that point will take responsibility for keeping the document up-to-date.</w:t>
+      </w:r>
+    </w:p>
+    <w:p>
+      <w:pPr>
         <w:rPr>
           <w:i/>
           <w:iCs/>
         </w:rPr>
-        <w:t>up-to-date</w:t>
-      </w:r>
-      <w:proofErr w:type="gramEnd"/>
+      </w:pPr>
       <w:r>
         <w:rPr>
           <w:i/>
           <w:iCs/>
         </w:rPr>
-        <w:t>.</w:t>
-      </w:r>
-    </w:p>
-    <w:p>
-      <w:pPr>
-        <w:rPr>
-          <w:i/>
-          <w:iCs/>
-        </w:rPr>
-      </w:pPr>
-      <w:r>
-        <w:rPr>
-          <w:i/>
-          <w:iCs/>
-        </w:rPr>
-        <w:t xml:space="preserve">8) Until the System Description Document template is converted to a wiki template, Applications </w:t>
-      </w:r>
-      <w:proofErr w:type="gramStart"/>
-      <w:r>
-        <w:rPr>
-          <w:i/>
-          <w:iCs/>
-        </w:rPr>
-        <w:t>Management  will</w:t>
-      </w:r>
-      <w:proofErr w:type="gramEnd"/>
-      <w:r>
-        <w:rPr>
-          <w:i/>
-          <w:iCs/>
-        </w:rPr>
-        <w:t xml:space="preserve"> add the System Description Document to the </w:t>
+        <w:t xml:space="preserve">8) Until the System Description Document template is converted to a wiki template, Applications Management  will add the System Description Document to the </w:t>
       </w:r>
       <w:proofErr w:type="spellStart"/>
       <w:r>
@@ -2346,12 +2354,6 @@
         <w:gridCol w:w="4140"/>
       </w:tblGrid>
       <w:tr>
-        <w:tblPrEx>
-          <w:tblCellMar>
-            <w:top w:w="0" w:type="dxa"/>
-            <w:bottom w:w="0" w:type="dxa"/>
-          </w:tblCellMar>
-        </w:tblPrEx>
         <w:tc>
           <w:tcPr>
             <w:tcW w:w="2808" w:type="dxa"/>
@@ -2418,12 +2420,6 @@
         </w:tc>
       </w:tr>
       <w:tr>
-        <w:tblPrEx>
-          <w:tblCellMar>
-            <w:top w:w="0" w:type="dxa"/>
-            <w:bottom w:w="0" w:type="dxa"/>
-          </w:tblCellMar>
-        </w:tblPrEx>
         <w:tc>
           <w:tcPr>
             <w:tcW w:w="2808" w:type="dxa"/>
@@ -2460,12 +2456,6 @@
         </w:tc>
       </w:tr>
       <w:tr>
-        <w:tblPrEx>
-          <w:tblCellMar>
-            <w:top w:w="0" w:type="dxa"/>
-            <w:bottom w:w="0" w:type="dxa"/>
-          </w:tblCellMar>
-        </w:tblPrEx>
         <w:tc>
           <w:tcPr>
             <w:tcW w:w="2808" w:type="dxa"/>
@@ -2490,12 +2480,6 @@
         </w:tc>
       </w:tr>
       <w:tr>
-        <w:tblPrEx>
-          <w:tblCellMar>
-            <w:top w:w="0" w:type="dxa"/>
-            <w:bottom w:w="0" w:type="dxa"/>
-          </w:tblCellMar>
-        </w:tblPrEx>
         <w:tc>
           <w:tcPr>
             <w:tcW w:w="2808" w:type="dxa"/>
@@ -2520,12 +2504,6 @@
         </w:tc>
       </w:tr>
       <w:tr>
-        <w:tblPrEx>
-          <w:tblCellMar>
-            <w:top w:w="0" w:type="dxa"/>
-            <w:bottom w:w="0" w:type="dxa"/>
-          </w:tblCellMar>
-        </w:tblPrEx>
         <w:tc>
           <w:tcPr>
             <w:tcW w:w="2808" w:type="dxa"/>
@@ -2553,12 +2531,6 @@
         </w:tc>
       </w:tr>
       <w:tr>
-        <w:tblPrEx>
-          <w:tblCellMar>
-            <w:top w:w="0" w:type="dxa"/>
-            <w:bottom w:w="0" w:type="dxa"/>
-          </w:tblCellMar>
-        </w:tblPrEx>
         <w:tc>
           <w:tcPr>
             <w:tcW w:w="2808" w:type="dxa"/>
@@ -2583,12 +2555,6 @@
         </w:tc>
       </w:tr>
       <w:tr>
-        <w:tblPrEx>
-          <w:tblCellMar>
-            <w:top w:w="0" w:type="dxa"/>
-            <w:bottom w:w="0" w:type="dxa"/>
-          </w:tblCellMar>
-        </w:tblPrEx>
         <w:tc>
           <w:tcPr>
             <w:tcW w:w="2808" w:type="dxa"/>
@@ -2613,12 +2579,6 @@
         </w:tc>
       </w:tr>
       <w:tr>
-        <w:tblPrEx>
-          <w:tblCellMar>
-            <w:top w:w="0" w:type="dxa"/>
-            <w:bottom w:w="0" w:type="dxa"/>
-          </w:tblCellMar>
-        </w:tblPrEx>
         <w:tc>
           <w:tcPr>
             <w:tcW w:w="2808" w:type="dxa"/>
@@ -2688,12 +2648,6 @@
         <w:gridCol w:w="3037"/>
       </w:tblGrid>
       <w:tr>
-        <w:tblPrEx>
-          <w:tblCellMar>
-            <w:top w:w="0" w:type="dxa"/>
-            <w:bottom w:w="0" w:type="dxa"/>
-          </w:tblCellMar>
-        </w:tblPrEx>
         <w:tc>
           <w:tcPr>
             <w:tcW w:w="1008" w:type="dxa"/>
@@ -2801,12 +2755,6 @@
         </w:tc>
       </w:tr>
       <w:tr>
-        <w:tblPrEx>
-          <w:tblCellMar>
-            <w:top w:w="0" w:type="dxa"/>
-            <w:bottom w:w="0" w:type="dxa"/>
-          </w:tblCellMar>
-        </w:tblPrEx>
         <w:tc>
           <w:tcPr>
             <w:tcW w:w="1008" w:type="dxa"/>
@@ -2859,12 +2807,6 @@
         </w:tc>
       </w:tr>
       <w:tr>
-        <w:tblPrEx>
-          <w:tblCellMar>
-            <w:top w:w="0" w:type="dxa"/>
-            <w:bottom w:w="0" w:type="dxa"/>
-          </w:tblCellMar>
-        </w:tblPrEx>
         <w:tc>
           <w:tcPr>
             <w:tcW w:w="1008" w:type="dxa"/>
@@ -2897,12 +2839,6 @@
         </w:tc>
       </w:tr>
       <w:tr>
-        <w:tblPrEx>
-          <w:tblCellMar>
-            <w:top w:w="0" w:type="dxa"/>
-            <w:bottom w:w="0" w:type="dxa"/>
-          </w:tblCellMar>
-        </w:tblPrEx>
         <w:tc>
           <w:tcPr>
             <w:tcW w:w="1008" w:type="dxa"/>
@@ -2935,12 +2871,6 @@
         </w:tc>
       </w:tr>
       <w:tr>
-        <w:tblPrEx>
-          <w:tblCellMar>
-            <w:top w:w="0" w:type="dxa"/>
-            <w:bottom w:w="0" w:type="dxa"/>
-          </w:tblCellMar>
-        </w:tblPrEx>
         <w:tc>
           <w:tcPr>
             <w:tcW w:w="1008" w:type="dxa"/>
@@ -2973,12 +2903,6 @@
         </w:tc>
       </w:tr>
       <w:tr>
-        <w:tblPrEx>
-          <w:tblCellMar>
-            <w:top w:w="0" w:type="dxa"/>
-            <w:bottom w:w="0" w:type="dxa"/>
-          </w:tblCellMar>
-        </w:tblPrEx>
         <w:tc>
           <w:tcPr>
             <w:tcW w:w="1008" w:type="dxa"/>
@@ -3011,12 +2935,6 @@
         </w:tc>
       </w:tr>
       <w:tr>
-        <w:tblPrEx>
-          <w:tblCellMar>
-            <w:top w:w="0" w:type="dxa"/>
-            <w:bottom w:w="0" w:type="dxa"/>
-          </w:tblCellMar>
-        </w:tblPrEx>
         <w:tc>
           <w:tcPr>
             <w:tcW w:w="1008" w:type="dxa"/>
@@ -3049,12 +2967,6 @@
         </w:tc>
       </w:tr>
       <w:tr>
-        <w:tblPrEx>
-          <w:tblCellMar>
-            <w:top w:w="0" w:type="dxa"/>
-            <w:bottom w:w="0" w:type="dxa"/>
-          </w:tblCellMar>
-        </w:tblPrEx>
         <w:tc>
           <w:tcPr>
             <w:tcW w:w="1008" w:type="dxa"/>
@@ -3087,12 +2999,6 @@
         </w:tc>
       </w:tr>
       <w:tr>
-        <w:tblPrEx>
-          <w:tblCellMar>
-            <w:top w:w="0" w:type="dxa"/>
-            <w:bottom w:w="0" w:type="dxa"/>
-          </w:tblCellMar>
-        </w:tblPrEx>
         <w:tc>
           <w:tcPr>
             <w:tcW w:w="1008" w:type="dxa"/>
@@ -3473,23 +3379,7 @@
           <w:i/>
           <w:iCs/>
         </w:rPr>
-        <w:t xml:space="preserve">This section should be used to provide </w:t>
-      </w:r>
-      <w:proofErr w:type="gramStart"/>
-      <w:r>
-        <w:rPr>
-          <w:i/>
-          <w:iCs/>
-        </w:rPr>
-        <w:t>an</w:t>
-      </w:r>
-      <w:proofErr w:type="gramEnd"/>
-      <w:r>
-        <w:rPr>
-          <w:i/>
-          <w:iCs/>
-        </w:rPr>
-        <w:t xml:space="preserve"> </w:t>
+        <w:t xml:space="preserve">This section should be used to provide an </w:t>
       </w:r>
       <w:r>
         <w:rPr>
@@ -3572,6 +3462,7 @@
         </w:numPr>
       </w:pPr>
       <w:r>
+        <w:lastRenderedPageBreak/>
         <w:t>Game State (menu, gameplay, pause, win/loss)</w:t>
       </w:r>
     </w:p>
@@ -4074,25 +3965,16 @@
           <w:i/>
           <w:iCs/>
         </w:rPr>
-        <w:t>PHP</w:t>
-      </w:r>
-      <w:proofErr w:type="gramStart"/>
+        <w:t>PHP,.</w:t>
+      </w:r>
       <w:r>
         <w:rPr>
           <w:i/>
           <w:iCs/>
         </w:rPr>
-        <w:t>,.</w:t>
-      </w:r>
-      <w:r>
-        <w:rPr>
-          <w:i/>
-          <w:iCs/>
-        </w:rPr>
         <w:t>Also</w:t>
       </w:r>
       <w:proofErr w:type="spellEnd"/>
-      <w:proofErr w:type="gramEnd"/>
       <w:r>
         <w:rPr>
           <w:i/>
@@ -4961,23 +4843,7 @@
           <w:i/>
           <w:iCs/>
         </w:rPr>
-        <w:t xml:space="preserve">Relevant details of any 3rd Party involvement (company name, primary contact name, primary contact telephone number). State if parts of the function </w:t>
-      </w:r>
-      <w:proofErr w:type="gramStart"/>
-      <w:r>
-        <w:rPr>
-          <w:i/>
-          <w:iCs/>
-        </w:rPr>
-        <w:t>is</w:t>
-      </w:r>
-      <w:proofErr w:type="gramEnd"/>
-      <w:r>
-        <w:rPr>
-          <w:i/>
-          <w:iCs/>
-        </w:rPr>
-        <w:t xml:space="preserve"> delivered by different parties.</w:t>
+        <w:t>Relevant details of any 3rd Party involvement (company name, primary contact name, primary contact telephone number). State if parts of the function is delivered by different parties.</w:t>
       </w:r>
     </w:p>
     <w:p>
@@ -5581,55 +5447,23 @@
           <w:i/>
           <w:iCs/>
         </w:rPr>
-        <w:t xml:space="preserve">For scheduled tasks that have failed, can they be run manually and if </w:t>
-      </w:r>
-      <w:proofErr w:type="gramStart"/>
+        <w:t xml:space="preserve">For scheduled tasks that have failed, can they be run manually and if so how?  Are there implications of running during the day? Is there any </w:t>
+      </w:r>
+      <w:proofErr w:type="spellStart"/>
       <w:r>
         <w:rPr>
           <w:i/>
           <w:iCs/>
         </w:rPr>
-        <w:t>so</w:t>
-      </w:r>
-      <w:proofErr w:type="gramEnd"/>
+        <w:t>clean up</w:t>
+      </w:r>
+      <w:proofErr w:type="spellEnd"/>
       <w:r>
         <w:rPr>
           <w:i/>
           <w:iCs/>
         </w:rPr>
-        <w:t xml:space="preserve"> how?  Are there implications of running during the day? Is there any </w:t>
-      </w:r>
-      <w:proofErr w:type="spellStart"/>
-      <w:r>
-        <w:rPr>
-          <w:i/>
-          <w:iCs/>
-        </w:rPr>
-        <w:t>clean up</w:t>
-      </w:r>
-      <w:proofErr w:type="spellEnd"/>
-      <w:r>
-        <w:rPr>
-          <w:i/>
-          <w:iCs/>
-        </w:rPr>
-        <w:t xml:space="preserve"> work that </w:t>
-      </w:r>
-      <w:proofErr w:type="gramStart"/>
-      <w:r>
-        <w:rPr>
-          <w:i/>
-          <w:iCs/>
-        </w:rPr>
-        <w:t>has to</w:t>
-      </w:r>
-      <w:proofErr w:type="gramEnd"/>
-      <w:r>
-        <w:rPr>
-          <w:i/>
-          <w:iCs/>
-        </w:rPr>
-        <w:t xml:space="preserve"> be done before retrying? Where possible, this would include step by step instructions</w:t>
+        <w:t xml:space="preserve"> work that has to be done before retrying? Where possible, this would include step by step instructions</w:t>
       </w:r>
     </w:p>
     <w:p/>
@@ -5724,19 +5558,11 @@
                 <w:lang w:val="en-US"/>
               </w:rPr>
             </w:pPr>
-            <w:proofErr w:type="gramStart"/>
             <w:r>
               <w:rPr>
                 <w:lang w:val="en-US"/>
               </w:rPr>
-              <w:t>Game does</w:t>
-            </w:r>
-            <w:proofErr w:type="gramEnd"/>
-            <w:r>
-              <w:rPr>
-                <w:lang w:val="en-US"/>
-              </w:rPr>
-              <w:t xml:space="preserve"> not launch</w:t>
+              <w:t>Game does not launch</w:t>
             </w:r>
           </w:p>
         </w:tc>
@@ -6278,13 +6104,28 @@
     </w:p>
     <w:p>
       <w:r>
-        <w:t xml:space="preserve">Please add other </w:t>
+        <w:t>A</w:t>
+      </w:r>
+      <w:r>
+        <w:t xml:space="preserve">dd </w:t>
+      </w:r>
+      <w:r>
+        <w:t>additional</w:t>
+      </w:r>
+      <w:r>
+        <w:t xml:space="preserve"> </w:t>
       </w:r>
       <w:r>
         <w:t>sign-off</w:t>
       </w:r>
       <w:r>
-        <w:t xml:space="preserve"> roles where required:</w:t>
+        <w:t xml:space="preserve"> roles </w:t>
+      </w:r>
+      <w:r>
+        <w:t>if</w:t>
+      </w:r>
+      <w:r>
+        <w:t xml:space="preserve"> required:</w:t>
       </w:r>
     </w:p>
     <w:p/>
@@ -6367,6 +6208,46 @@
               </w:rPr>
               <w:t>Date</w:t>
             </w:r>
+          </w:p>
+        </w:tc>
+      </w:tr>
+      <w:tr>
+        <w:tc>
+          <w:tcPr>
+            <w:tcW w:w="1984" w:type="pct"/>
+            <w:shd w:val="clear" w:color="auto" w:fill="E0E0E0"/>
+          </w:tcPr>
+          <w:p>
+            <w:r>
+              <w:t>Application Management</w:t>
+            </w:r>
+          </w:p>
+        </w:tc>
+        <w:tc>
+          <w:tcPr>
+            <w:tcW w:w="2136" w:type="pct"/>
+          </w:tcPr>
+          <w:p>
+            <w:pPr>
+              <w:rPr>
+                <w:b/>
+                <w:bCs/>
+              </w:rPr>
+            </w:pPr>
+          </w:p>
+        </w:tc>
+        <w:tc>
+          <w:tcPr>
+            <w:tcW w:w="880" w:type="pct"/>
+          </w:tcPr>
+          <w:p>
+            <w:pPr>
+              <w:jc w:val="center"/>
+              <w:rPr>
+                <w:b/>
+                <w:bCs/>
+              </w:rPr>
+            </w:pPr>
           </w:p>
         </w:tc>
       </w:tr>
@@ -6721,13 +6602,16 @@
       <w:tblLook w:val="01E0" w:firstRow="1" w:lastRow="1" w:firstColumn="1" w:lastColumn="1" w:noHBand="0" w:noVBand="0"/>
     </w:tblPr>
     <w:tblGrid>
-      <w:gridCol w:w="4161"/>
-      <w:gridCol w:w="4145"/>
+      <w:gridCol w:w="6151"/>
+      <w:gridCol w:w="2155"/>
     </w:tblGrid>
     <w:tr>
+      <w:trPr>
+        <w:trHeight w:val="539"/>
+      </w:trPr>
       <w:tc>
         <w:tcPr>
-          <w:tcW w:w="4643" w:type="dxa"/>
+          <w:tcW w:w="6570" w:type="dxa"/>
         </w:tcPr>
         <w:p>
           <w:pPr>
@@ -6750,6 +6634,9 @@
         <w:p>
           <w:pPr>
             <w:pStyle w:val="Header"/>
+            <w:tabs>
+              <w:tab w:val="clear" w:pos="8306"/>
+            </w:tabs>
           </w:pPr>
           <w:r>
             <w:t xml:space="preserve">Version: </w:t>
@@ -6761,14 +6648,18 @@
       </w:tc>
       <w:tc>
         <w:tcPr>
-          <w:tcW w:w="4643" w:type="dxa"/>
+          <w:tcW w:w="2250" w:type="dxa"/>
         </w:tcPr>
         <w:p>
           <w:pPr>
             <w:pStyle w:val="Header"/>
+            <w:tabs>
+              <w:tab w:val="clear" w:pos="4153"/>
+            </w:tabs>
+            <w:jc w:val="right"/>
           </w:pPr>
           <w:r>
-            <w:t>Insomniac</w:t>
+            <w:t>Insomnia</w:t>
           </w:r>
         </w:p>
       </w:tc>
@@ -13451,6 +13342,50 @@
     <w:lsdException w:name="Subtitle" w:qFormat="1"/>
     <w:lsdException w:name="Strong" w:qFormat="1"/>
     <w:lsdException w:name="Emphasis" w:qFormat="1"/>
+    <w:lsdException w:name="Normal Table" w:semiHidden="1" w:unhideWhenUsed="1"/>
+    <w:lsdException w:name="Table Simple 1" w:semiHidden="1" w:unhideWhenUsed="1"/>
+    <w:lsdException w:name="Table Simple 2" w:semiHidden="1" w:unhideWhenUsed="1"/>
+    <w:lsdException w:name="Table Simple 3" w:semiHidden="1" w:unhideWhenUsed="1"/>
+    <w:lsdException w:name="Table Classic 1" w:semiHidden="1" w:unhideWhenUsed="1"/>
+    <w:lsdException w:name="Table Classic 2" w:semiHidden="1" w:unhideWhenUsed="1"/>
+    <w:lsdException w:name="Table Classic 3" w:semiHidden="1" w:unhideWhenUsed="1"/>
+    <w:lsdException w:name="Table Classic 4" w:semiHidden="1" w:unhideWhenUsed="1"/>
+    <w:lsdException w:name="Table Colorful 1" w:semiHidden="1" w:unhideWhenUsed="1"/>
+    <w:lsdException w:name="Table Colorful 2" w:semiHidden="1" w:unhideWhenUsed="1"/>
+    <w:lsdException w:name="Table Colorful 3" w:semiHidden="1" w:unhideWhenUsed="1"/>
+    <w:lsdException w:name="Table Columns 1" w:semiHidden="1" w:unhideWhenUsed="1"/>
+    <w:lsdException w:name="Table Columns 2" w:semiHidden="1" w:unhideWhenUsed="1"/>
+    <w:lsdException w:name="Table Columns 3" w:semiHidden="1" w:unhideWhenUsed="1"/>
+    <w:lsdException w:name="Table Columns 4" w:semiHidden="1" w:unhideWhenUsed="1"/>
+    <w:lsdException w:name="Table Columns 5" w:semiHidden="1" w:unhideWhenUsed="1"/>
+    <w:lsdException w:name="Table Grid 1" w:semiHidden="1" w:unhideWhenUsed="1"/>
+    <w:lsdException w:name="Table Grid 2" w:semiHidden="1" w:unhideWhenUsed="1"/>
+    <w:lsdException w:name="Table Grid 3" w:semiHidden="1" w:unhideWhenUsed="1"/>
+    <w:lsdException w:name="Table Grid 4" w:semiHidden="1" w:unhideWhenUsed="1"/>
+    <w:lsdException w:name="Table Grid 5" w:semiHidden="1" w:unhideWhenUsed="1"/>
+    <w:lsdException w:name="Table Grid 6" w:semiHidden="1" w:unhideWhenUsed="1"/>
+    <w:lsdException w:name="Table Grid 7" w:semiHidden="1" w:unhideWhenUsed="1"/>
+    <w:lsdException w:name="Table Grid 8" w:semiHidden="1" w:unhideWhenUsed="1"/>
+    <w:lsdException w:name="Table List 1" w:semiHidden="1" w:unhideWhenUsed="1"/>
+    <w:lsdException w:name="Table List 2" w:semiHidden="1" w:unhideWhenUsed="1"/>
+    <w:lsdException w:name="Table List 3" w:semiHidden="1" w:unhideWhenUsed="1"/>
+    <w:lsdException w:name="Table List 4" w:semiHidden="1" w:unhideWhenUsed="1"/>
+    <w:lsdException w:name="Table List 5" w:semiHidden="1" w:unhideWhenUsed="1"/>
+    <w:lsdException w:name="Table List 6" w:semiHidden="1" w:unhideWhenUsed="1"/>
+    <w:lsdException w:name="Table List 7" w:semiHidden="1" w:unhideWhenUsed="1"/>
+    <w:lsdException w:name="Table List 8" w:semiHidden="1" w:unhideWhenUsed="1"/>
+    <w:lsdException w:name="Table 3D effects 1" w:semiHidden="1" w:unhideWhenUsed="1"/>
+    <w:lsdException w:name="Table 3D effects 2" w:semiHidden="1" w:unhideWhenUsed="1"/>
+    <w:lsdException w:name="Table 3D effects 3" w:semiHidden="1" w:unhideWhenUsed="1"/>
+    <w:lsdException w:name="Table Contemporary" w:semiHidden="1" w:unhideWhenUsed="1"/>
+    <w:lsdException w:name="Table Elegant" w:semiHidden="1" w:unhideWhenUsed="1"/>
+    <w:lsdException w:name="Table Professional" w:semiHidden="1" w:unhideWhenUsed="1"/>
+    <w:lsdException w:name="Table Subtle 1" w:semiHidden="1" w:unhideWhenUsed="1"/>
+    <w:lsdException w:name="Table Subtle 2" w:semiHidden="1" w:unhideWhenUsed="1"/>
+    <w:lsdException w:name="Table Web 1" w:semiHidden="1" w:unhideWhenUsed="1"/>
+    <w:lsdException w:name="Table Web 2" w:semiHidden="1" w:unhideWhenUsed="1"/>
+    <w:lsdException w:name="Table Web 3" w:semiHidden="1" w:unhideWhenUsed="1"/>
+    <w:lsdException w:name="Table Theme" w:semiHidden="1" w:unhideWhenUsed="1"/>
     <w:lsdException w:name="Placeholder Text" w:semiHidden="1" w:uiPriority="99"/>
     <w:lsdException w:name="No Spacing" w:uiPriority="1" w:qFormat="1"/>
     <w:lsdException w:name="Light Shading" w:uiPriority="60"/>
@@ -13864,11 +13799,15 @@
   </w:style>
   <w:style w:type="character" w:default="1" w:styleId="DefaultParagraphFont">
     <w:name w:val="Default Paragraph Font"/>
+    <w:uiPriority w:val="1"/>
     <w:semiHidden/>
+    <w:unhideWhenUsed/>
   </w:style>
   <w:style w:type="table" w:default="1" w:styleId="TableNormal">
     <w:name w:val="Normal Table"/>
+    <w:uiPriority w:val="99"/>
     <w:semiHidden/>
+    <w:unhideWhenUsed/>
     <w:tblPr>
       <w:tblInd w:w="0" w:type="dxa"/>
       <w:tblCellMar>
@@ -13881,7 +13820,9 @@
   </w:style>
   <w:style w:type="numbering" w:default="1" w:styleId="NoList">
     <w:name w:val="No List"/>
+    <w:uiPriority w:val="99"/>
     <w:semiHidden/>
+    <w:unhideWhenUsed/>
   </w:style>
   <w:style w:type="paragraph" w:styleId="TOC1">
     <w:name w:val="toc 1"/>
@@ -14263,6 +14204,44 @@
       <w:lang w:val="en-GB"/>
     </w:rPr>
   </w:style>
+  <w:style w:type="paragraph" w:styleId="IntenseQuote">
+    <w:name w:val="Intense Quote"/>
+    <w:basedOn w:val="Normal"/>
+    <w:next w:val="Normal"/>
+    <w:link w:val="IntenseQuoteChar"/>
+    <w:uiPriority w:val="30"/>
+    <w:qFormat/>
+    <w:rsid w:val="00B87DEE"/>
+    <w:pPr>
+      <w:pBdr>
+        <w:top w:val="single" w:sz="4" w:space="10" w:color="156082" w:themeColor="accent1"/>
+        <w:bottom w:val="single" w:sz="4" w:space="10" w:color="156082" w:themeColor="accent1"/>
+      </w:pBdr>
+      <w:spacing w:before="360" w:after="360"/>
+      <w:ind w:left="864" w:right="864"/>
+      <w:jc w:val="center"/>
+    </w:pPr>
+    <w:rPr>
+      <w:i/>
+      <w:iCs/>
+      <w:color w:val="156082" w:themeColor="accent1"/>
+    </w:rPr>
+  </w:style>
+  <w:style w:type="character" w:customStyle="1" w:styleId="IntenseQuoteChar">
+    <w:name w:val="Intense Quote Char"/>
+    <w:basedOn w:val="DefaultParagraphFont"/>
+    <w:link w:val="IntenseQuote"/>
+    <w:uiPriority w:val="30"/>
+    <w:rsid w:val="00B87DEE"/>
+    <w:rPr>
+      <w:i/>
+      <w:iCs/>
+      <w:color w:val="156082" w:themeColor="accent1"/>
+      <w:sz w:val="22"/>
+      <w:szCs w:val="24"/>
+      <w:lang w:val="en-GB"/>
+    </w:rPr>
+  </w:style>
 </w:styles>
 </file>
 

</xml_diff>